<commit_message>
Fix image and used APA
</commit_message>
<xml_diff>
--- a/Persona #2.docx
+++ b/Persona #2.docx
@@ -29,6 +29,22 @@
         </w:rPr>
         <w:t>Toby Conners</w:t>
       </w:r>
+    </w:p>
+    <w:p>
+      <w:r>
+        <w:t xml:space="preserve">Image from. </w:t>
+      </w:r>
+      <w:r>
+        <w:t xml:space="preserve">OpenAI. (2026). AI-generated image of a 22-year-old lawyer headshot [AI-generated image]. DALL·E. </w:t>
+      </w:r>
+      <w:hyperlink r:id="rId11" w:history="1">
+        <w:r>
+          <w:rPr>
+            <w:rStyle w:val="Hyperlink"/>
+          </w:rPr>
+          <w:t>https://openai.com</w:t>
+        </w:r>
+      </w:hyperlink>
     </w:p>
     <w:p>
       <w:pPr>
@@ -90,23 +106,17 @@
             </w:pPr>
             <w:r>
               <w:rPr>
+                <w:b/>
                 <w:noProof/>
+                <w:color w:val="000000" w:themeColor="text1"/>
                 <w:sz w:val="22"/>
                 <w:szCs w:val="22"/>
               </w:rPr>
               <w:drawing>
-                <wp:anchor distT="0" distB="0" distL="114300" distR="114300" simplePos="0" relativeHeight="251658240" behindDoc="0" locked="0" layoutInCell="1" allowOverlap="1" wp14:anchorId="1079B1CB" wp14:editId="04A23CF1">
-                  <wp:simplePos x="0" y="0"/>
-                  <wp:positionH relativeFrom="column">
-                    <wp:posOffset>43180</wp:posOffset>
-                  </wp:positionH>
-                  <wp:positionV relativeFrom="paragraph">
-                    <wp:posOffset>-2139315</wp:posOffset>
-                  </wp:positionV>
-                  <wp:extent cx="1586230" cy="2244725"/>
-                  <wp:effectExtent l="0" t="0" r="0" b="3175"/>
-                  <wp:wrapTopAndBottom/>
-                  <wp:docPr id="1660972917" name="Picture 1"/>
+                <wp:inline distT="0" distB="0" distL="0" distR="0" wp14:anchorId="54745EC4" wp14:editId="57BD3774">
+                  <wp:extent cx="1554480" cy="2349326"/>
+                  <wp:effectExtent l="0" t="0" r="7620" b="0"/>
+                  <wp:docPr id="940039842" name="Picture 1"/>
                   <wp:cNvGraphicFramePr>
                     <a:graphicFrameLocks xmlns:a="http://schemas.openxmlformats.org/drawingml/2006/main" noChangeAspect="1"/>
                   </wp:cNvGraphicFramePr>
@@ -114,11 +124,11 @@
                     <a:graphicData uri="http://schemas.openxmlformats.org/drawingml/2006/picture">
                       <pic:pic xmlns:pic="http://schemas.openxmlformats.org/drawingml/2006/picture">
                         <pic:nvPicPr>
-                          <pic:cNvPr id="1660972917" name="Picture 1660972917"/>
+                          <pic:cNvPr id="940039842" name="Picture 940039842"/>
                           <pic:cNvPicPr/>
                         </pic:nvPicPr>
                         <pic:blipFill>
-                          <a:blip r:embed="rId11" cstate="print">
+                          <a:blip r:embed="rId12" cstate="print">
                             <a:extLst>
                               <a:ext uri="{28A0092B-C50C-407E-A947-70E740481C1C}">
                                 <a14:useLocalDpi xmlns:a14="http://schemas.microsoft.com/office/drawing/2010/main" val="0"/>
@@ -132,7 +142,7 @@
                         <pic:spPr>
                           <a:xfrm>
                             <a:off x="0" y="0"/>
-                            <a:ext cx="1586230" cy="2244725"/>
+                            <a:ext cx="1566296" cy="2367184"/>
                           </a:xfrm>
                           <a:prstGeom prst="rect">
                             <a:avLst/>
@@ -141,13 +151,7 @@
                       </pic:pic>
                     </a:graphicData>
                   </a:graphic>
-                  <wp14:sizeRelH relativeFrom="margin">
-                    <wp14:pctWidth>0</wp14:pctWidth>
-                  </wp14:sizeRelH>
-                  <wp14:sizeRelV relativeFrom="margin">
-                    <wp14:pctHeight>0</wp14:pctHeight>
-                  </wp14:sizeRelV>
-                </wp:anchor>
+                </wp:inline>
               </w:drawing>
             </w:r>
           </w:p>
@@ -172,6 +176,14 @@
                 <w:szCs w:val="22"/>
               </w:rPr>
             </w:pPr>
+            <w:r>
+              <w:rPr>
+                <w:b/>
+                <w:sz w:val="28"/>
+                <w:szCs w:val="22"/>
+              </w:rPr>
+              <w:t xml:space="preserve"> </w:t>
+            </w:r>
           </w:p>
         </w:tc>
         <w:tc>
@@ -652,7 +664,7 @@
                 <w:sz w:val="22"/>
                 <w:szCs w:val="22"/>
               </w:rPr>
-              <w:t>Riding</w:t>
+              <w:t xml:space="preserve">Removing </w:t>
             </w:r>
             <w:r>
               <w:rPr>
@@ -660,7 +672,7 @@
                 <w:sz w:val="22"/>
                 <w:szCs w:val="22"/>
               </w:rPr>
-              <w:t xml:space="preserve"> the world of scum criminals</w:t>
+              <w:t>scum criminals</w:t>
             </w:r>
           </w:p>
           <w:p>
@@ -2914,6 +2926,82 @@
           <w:tcPr>
             <w:tcW w:w="436" w:type="dxa"/>
             <w:vMerge/>
+            <w:vAlign w:val="center"/>
+          </w:tcPr>
+          <w:p>
+            <w:pPr>
+              <w:rPr>
+                <w:b/>
+                <w:color w:val="000000" w:themeColor="text1"/>
+                <w:sz w:val="22"/>
+                <w:szCs w:val="22"/>
+              </w:rPr>
+            </w:pPr>
+          </w:p>
+        </w:tc>
+        <w:tc>
+          <w:tcPr>
+            <w:tcW w:w="4512" w:type="dxa"/>
+            <w:vMerge/>
+            <w:vAlign w:val="center"/>
+          </w:tcPr>
+          <w:p>
+            <w:pPr>
+              <w:rPr>
+                <w:b/>
+                <w:color w:val="000000" w:themeColor="text1"/>
+                <w:sz w:val="22"/>
+                <w:szCs w:val="22"/>
+              </w:rPr>
+            </w:pPr>
+          </w:p>
+        </w:tc>
+        <w:tc>
+          <w:tcPr>
+            <w:tcW w:w="436" w:type="dxa"/>
+            <w:vMerge/>
+            <w:vAlign w:val="center"/>
+          </w:tcPr>
+          <w:p>
+            <w:pPr>
+              <w:rPr>
+                <w:b/>
+                <w:color w:val="000000" w:themeColor="text1"/>
+                <w:sz w:val="22"/>
+                <w:szCs w:val="22"/>
+              </w:rPr>
+            </w:pPr>
+          </w:p>
+        </w:tc>
+      </w:tr>
+      <w:tr>
+        <w:trPr>
+          <w:gridAfter w:val="1"/>
+          <w:wAfter w:w="4512" w:type="dxa"/>
+          <w:trHeight w:val="288"/>
+        </w:trPr>
+        <w:tc>
+          <w:tcPr>
+            <w:tcW w:w="4512" w:type="dxa"/>
+            <w:gridSpan w:val="2"/>
+            <w:shd w:val="clear" w:color="auto" w:fill="FFC000"/>
+            <w:vAlign w:val="center"/>
+          </w:tcPr>
+          <w:p>
+            <w:pPr>
+              <w:rPr>
+                <w:b/>
+                <w:noProof/>
+                <w:color w:val="000000" w:themeColor="text1"/>
+                <w:sz w:val="22"/>
+                <w:szCs w:val="22"/>
+              </w:rPr>
+            </w:pPr>
+          </w:p>
+        </w:tc>
+        <w:tc>
+          <w:tcPr>
+            <w:tcW w:w="436" w:type="dxa"/>
             <w:tcBorders>
               <w:bottom w:val="nil"/>
             </w:tcBorders>
@@ -2933,7 +3021,6 @@
         <w:tc>
           <w:tcPr>
             <w:tcW w:w="4512" w:type="dxa"/>
-            <w:vMerge/>
             <w:vAlign w:val="center"/>
           </w:tcPr>
           <w:p>
@@ -2950,7 +3037,6 @@
         <w:tc>
           <w:tcPr>
             <w:tcW w:w="436" w:type="dxa"/>
-            <w:vMerge/>
             <w:tcBorders>
               <w:bottom w:val="nil"/>
             </w:tcBorders>
@@ -2977,8 +3063,8 @@
           <w:szCs w:val="22"/>
         </w:rPr>
         <w:sectPr>
-          <w:footerReference w:type="even" r:id="rId12"/>
-          <w:footerReference w:type="default" r:id="rId13"/>
+          <w:footerReference w:type="even" r:id="rId13"/>
+          <w:footerReference w:type="default" r:id="rId14"/>
           <w:pgSz w:w="24480" w:h="15840" w:orient="landscape" w:code="3"/>
           <w:pgMar w:top="720" w:right="720" w:bottom="720" w:left="720" w:header="720" w:footer="720" w:gutter="0"/>
           <w:cols w:space="720"/>
@@ -3036,6 +3122,11 @@
         <w:docPartUnique/>
       </w:docPartObj>
     </w:sdtPr>
+    <w:sdtEndPr>
+      <w:rPr>
+        <w:rStyle w:val="PageNumber"/>
+      </w:rPr>
+    </w:sdtEndPr>
     <w:sdtContent>
       <w:p>
         <w:pPr>
@@ -7352,7 +7443,130 @@
 </file>
 
 <file path=customXml/item1.xml><?xml version="1.0" encoding="utf-8"?>
-<b:Sources xmlns:b="http://schemas.openxmlformats.org/officeDocument/2006/bibliography" xmlns="http://schemas.openxmlformats.org/officeDocument/2006/bibliography" SelectedStyle="/APASixthEditionOfficeOnline.xsl" StyleName="APA" Version="6"/>
+<p:properties xmlns:p="http://schemas.microsoft.com/office/2006/metadata/properties" xmlns:xsi="http://www.w3.org/2001/XMLSchema-instance" xmlns:pc="http://schemas.microsoft.com/office/infopath/2007/PartnerControls">
+  <documentManagement>
+    <DirectSourceMarket xmlns="4873beb7-5857-4685-be1f-d57550cc96cc" xsi:nil="true"/>
+    <ApprovalStatus xmlns="4873beb7-5857-4685-be1f-d57550cc96cc">InProgress</ApprovalStatus>
+    <MarketSpecific xmlns="4873beb7-5857-4685-be1f-d57550cc96cc">false</MarketSpecific>
+    <LocComments xmlns="4873beb7-5857-4685-be1f-d57550cc96cc" xsi:nil="true"/>
+    <ThumbnailAssetId xmlns="4873beb7-5857-4685-be1f-d57550cc96cc" xsi:nil="true"/>
+    <PrimaryImageGen xmlns="4873beb7-5857-4685-be1f-d57550cc96cc">true</PrimaryImageGen>
+    <LegacyData xmlns="4873beb7-5857-4685-be1f-d57550cc96cc" xsi:nil="true"/>
+    <LocRecommendedHandoff xmlns="4873beb7-5857-4685-be1f-d57550cc96cc" xsi:nil="true"/>
+    <BusinessGroup xmlns="4873beb7-5857-4685-be1f-d57550cc96cc" xsi:nil="true"/>
+    <BlockPublish xmlns="4873beb7-5857-4685-be1f-d57550cc96cc">false</BlockPublish>
+    <TPFriendlyName xmlns="4873beb7-5857-4685-be1f-d57550cc96cc" xsi:nil="true"/>
+    <NumericId xmlns="4873beb7-5857-4685-be1f-d57550cc96cc" xsi:nil="true"/>
+    <APEditor xmlns="4873beb7-5857-4685-be1f-d57550cc96cc">
+      <UserInfo>
+        <DisplayName/>
+        <AccountId xsi:nil="true"/>
+        <AccountType/>
+      </UserInfo>
+    </APEditor>
+    <SourceTitle xmlns="4873beb7-5857-4685-be1f-d57550cc96cc" xsi:nil="true"/>
+    <OpenTemplate xmlns="4873beb7-5857-4685-be1f-d57550cc96cc">true</OpenTemplate>
+    <UALocComments xmlns="4873beb7-5857-4685-be1f-d57550cc96cc">2007 Template UpLeveling Do Not HandOff</UALocComments>
+    <ParentAssetId xmlns="4873beb7-5857-4685-be1f-d57550cc96cc" xsi:nil="true"/>
+    <IntlLangReviewDate xmlns="4873beb7-5857-4685-be1f-d57550cc96cc" xsi:nil="true"/>
+    <FeatureTagsTaxHTField0 xmlns="4873beb7-5857-4685-be1f-d57550cc96cc">
+      <Terms xmlns="http://schemas.microsoft.com/office/infopath/2007/PartnerControls"/>
+    </FeatureTagsTaxHTField0>
+    <PublishStatusLookup xmlns="4873beb7-5857-4685-be1f-d57550cc96cc">
+      <Value>1370089</Value>
+      <Value>1531210</Value>
+    </PublishStatusLookup>
+    <Providers xmlns="4873beb7-5857-4685-be1f-d57550cc96cc" xsi:nil="true"/>
+    <MachineTranslated xmlns="4873beb7-5857-4685-be1f-d57550cc96cc">false</MachineTranslated>
+    <OriginalSourceMarket xmlns="4873beb7-5857-4685-be1f-d57550cc96cc" xsi:nil="true"/>
+    <APDescription xmlns="4873beb7-5857-4685-be1f-d57550cc96cc" xsi:nil="true"/>
+    <ClipArtFilename xmlns="4873beb7-5857-4685-be1f-d57550cc96cc" xsi:nil="true"/>
+    <ContentItem xmlns="4873beb7-5857-4685-be1f-d57550cc96cc" xsi:nil="true"/>
+    <TPInstallLocation xmlns="4873beb7-5857-4685-be1f-d57550cc96cc" xsi:nil="true"/>
+    <PublishTargets xmlns="4873beb7-5857-4685-be1f-d57550cc96cc">OfficeOnline,OfficeOnlineVNext</PublishTargets>
+    <TimesCloned xmlns="4873beb7-5857-4685-be1f-d57550cc96cc" xsi:nil="true"/>
+    <AssetStart xmlns="4873beb7-5857-4685-be1f-d57550cc96cc">2011-12-15T21:13:00+00:00</AssetStart>
+    <Provider xmlns="4873beb7-5857-4685-be1f-d57550cc96cc" xsi:nil="true"/>
+    <AcquiredFrom xmlns="4873beb7-5857-4685-be1f-d57550cc96cc">Internal MS</AcquiredFrom>
+    <FriendlyTitle xmlns="4873beb7-5857-4685-be1f-d57550cc96cc" xsi:nil="true"/>
+    <LastHandOff xmlns="4873beb7-5857-4685-be1f-d57550cc96cc" xsi:nil="true"/>
+    <TPClientViewer xmlns="4873beb7-5857-4685-be1f-d57550cc96cc" xsi:nil="true"/>
+    <ShowIn xmlns="4873beb7-5857-4685-be1f-d57550cc96cc">Show everywhere</ShowIn>
+    <UANotes xmlns="4873beb7-5857-4685-be1f-d57550cc96cc" xsi:nil="true"/>
+    <TemplateStatus xmlns="4873beb7-5857-4685-be1f-d57550cc96cc">Complete</TemplateStatus>
+    <InternalTagsTaxHTField0 xmlns="4873beb7-5857-4685-be1f-d57550cc96cc">
+      <Terms xmlns="http://schemas.microsoft.com/office/infopath/2007/PartnerControls"/>
+    </InternalTagsTaxHTField0>
+    <CSXHash xmlns="4873beb7-5857-4685-be1f-d57550cc96cc" xsi:nil="true"/>
+    <Downloads xmlns="4873beb7-5857-4685-be1f-d57550cc96cc">0</Downloads>
+    <VoteCount xmlns="4873beb7-5857-4685-be1f-d57550cc96cc" xsi:nil="true"/>
+    <OOCacheId xmlns="4873beb7-5857-4685-be1f-d57550cc96cc" xsi:nil="true"/>
+    <IsDeleted xmlns="4873beb7-5857-4685-be1f-d57550cc96cc">false</IsDeleted>
+    <AssetExpire xmlns="4873beb7-5857-4685-be1f-d57550cc96cc">2035-01-01T08:00:00+00:00</AssetExpire>
+    <DSATActionTaken xmlns="4873beb7-5857-4685-be1f-d57550cc96cc" xsi:nil="true"/>
+    <CSXSubmissionMarket xmlns="4873beb7-5857-4685-be1f-d57550cc96cc" xsi:nil="true"/>
+    <TPExecutable xmlns="4873beb7-5857-4685-be1f-d57550cc96cc" xsi:nil="true"/>
+    <SubmitterId xmlns="4873beb7-5857-4685-be1f-d57550cc96cc" xsi:nil="true"/>
+    <EditorialTags xmlns="4873beb7-5857-4685-be1f-d57550cc96cc" xsi:nil="true"/>
+    <ApprovalLog xmlns="4873beb7-5857-4685-be1f-d57550cc96cc" xsi:nil="true"/>
+    <AssetType xmlns="4873beb7-5857-4685-be1f-d57550cc96cc">TP</AssetType>
+    <BugNumber xmlns="4873beb7-5857-4685-be1f-d57550cc96cc" xsi:nil="true"/>
+    <CSXSubmissionDate xmlns="4873beb7-5857-4685-be1f-d57550cc96cc" xsi:nil="true"/>
+    <CSXUpdate xmlns="4873beb7-5857-4685-be1f-d57550cc96cc">false</CSXUpdate>
+    <Milestone xmlns="4873beb7-5857-4685-be1f-d57550cc96cc" xsi:nil="true"/>
+    <RecommendationsModifier xmlns="4873beb7-5857-4685-be1f-d57550cc96cc" xsi:nil="true"/>
+    <OriginAsset xmlns="4873beb7-5857-4685-be1f-d57550cc96cc" xsi:nil="true"/>
+    <TPComponent xmlns="4873beb7-5857-4685-be1f-d57550cc96cc" xsi:nil="true"/>
+    <AssetId xmlns="4873beb7-5857-4685-be1f-d57550cc96cc">TP102802872</AssetId>
+    <IntlLocPriority xmlns="4873beb7-5857-4685-be1f-d57550cc96cc" xsi:nil="true"/>
+    <PolicheckWords xmlns="4873beb7-5857-4685-be1f-d57550cc96cc" xsi:nil="true"/>
+    <TPLaunchHelpLink xmlns="4873beb7-5857-4685-be1f-d57550cc96cc" xsi:nil="true"/>
+    <TPApplication xmlns="4873beb7-5857-4685-be1f-d57550cc96cc" xsi:nil="true"/>
+    <CrawlForDependencies xmlns="4873beb7-5857-4685-be1f-d57550cc96cc">false</CrawlForDependencies>
+    <HandoffToMSDN xmlns="4873beb7-5857-4685-be1f-d57550cc96cc" xsi:nil="true"/>
+    <PlannedPubDate xmlns="4873beb7-5857-4685-be1f-d57550cc96cc" xsi:nil="true"/>
+    <IntlLangReviewer xmlns="4873beb7-5857-4685-be1f-d57550cc96cc" xsi:nil="true"/>
+    <TrustLevel xmlns="4873beb7-5857-4685-be1f-d57550cc96cc">1 Microsoft Managed Content</TrustLevel>
+    <LocLastLocAttemptVersionLookup xmlns="4873beb7-5857-4685-be1f-d57550cc96cc">715235</LocLastLocAttemptVersionLookup>
+    <IsSearchable xmlns="4873beb7-5857-4685-be1f-d57550cc96cc">true</IsSearchable>
+    <TemplateTemplateType xmlns="4873beb7-5857-4685-be1f-d57550cc96cc">Word 2007 Default</TemplateTemplateType>
+    <CampaignTagsTaxHTField0 xmlns="4873beb7-5857-4685-be1f-d57550cc96cc">
+      <Terms xmlns="http://schemas.microsoft.com/office/infopath/2007/PartnerControls"/>
+    </CampaignTagsTaxHTField0>
+    <TPNamespace xmlns="4873beb7-5857-4685-be1f-d57550cc96cc" xsi:nil="true"/>
+    <TaxCatchAll xmlns="4873beb7-5857-4685-be1f-d57550cc96cc"/>
+    <Markets xmlns="4873beb7-5857-4685-be1f-d57550cc96cc"/>
+    <UAProjectedTotalWords xmlns="4873beb7-5857-4685-be1f-d57550cc96cc" xsi:nil="true"/>
+    <IntlLangReview xmlns="4873beb7-5857-4685-be1f-d57550cc96cc">false</IntlLangReview>
+    <OutputCachingOn xmlns="4873beb7-5857-4685-be1f-d57550cc96cc">false</OutputCachingOn>
+    <AverageRating xmlns="4873beb7-5857-4685-be1f-d57550cc96cc" xsi:nil="true"/>
+    <APAuthor xmlns="4873beb7-5857-4685-be1f-d57550cc96cc">
+      <UserInfo>
+        <DisplayName>REDMOND\v-gakel</DisplayName>
+        <AccountId>2721</AccountId>
+        <AccountType/>
+      </UserInfo>
+    </APAuthor>
+    <LocManualTestRequired xmlns="4873beb7-5857-4685-be1f-d57550cc96cc">false</LocManualTestRequired>
+    <TPCommandLine xmlns="4873beb7-5857-4685-be1f-d57550cc96cc" xsi:nil="true"/>
+    <TPAppVersion xmlns="4873beb7-5857-4685-be1f-d57550cc96cc" xsi:nil="true"/>
+    <EditorialStatus xmlns="4873beb7-5857-4685-be1f-d57550cc96cc" xsi:nil="true"/>
+    <LastModifiedDateTime xmlns="4873beb7-5857-4685-be1f-d57550cc96cc" xsi:nil="true"/>
+    <ScenarioTagsTaxHTField0 xmlns="4873beb7-5857-4685-be1f-d57550cc96cc">
+      <Terms xmlns="http://schemas.microsoft.com/office/infopath/2007/PartnerControls"/>
+    </ScenarioTagsTaxHTField0>
+    <OriginalRelease xmlns="4873beb7-5857-4685-be1f-d57550cc96cc">14</OriginalRelease>
+    <TPLaunchHelpLinkType xmlns="4873beb7-5857-4685-be1f-d57550cc96cc">Template</TPLaunchHelpLinkType>
+    <LocalizationTagsTaxHTField0 xmlns="4873beb7-5857-4685-be1f-d57550cc96cc">
+      <Terms xmlns="http://schemas.microsoft.com/office/infopath/2007/PartnerControls"/>
+    </LocalizationTagsTaxHTField0>
+    <UACurrentWords xmlns="4873beb7-5857-4685-be1f-d57550cc96cc" xsi:nil="true"/>
+    <ArtSampleDocs xmlns="4873beb7-5857-4685-be1f-d57550cc96cc" xsi:nil="true"/>
+    <UALocRecommendation xmlns="4873beb7-5857-4685-be1f-d57550cc96cc">Localize</UALocRecommendation>
+    <Manager xmlns="4873beb7-5857-4685-be1f-d57550cc96cc" xsi:nil="true"/>
+    <LocMarketGroupTiers2 xmlns="4873beb7-5857-4685-be1f-d57550cc96cc">,t:Tier 1,t:Tier 2,t:Tier 3,</LocMarketGroupTiers2>
+  </documentManagement>
+</p:properties>
 </file>
 
 <file path=customXml/item2.xml><?xml version="1.0" encoding="utf-8"?>
@@ -8396,130 +8610,7 @@
 </file>
 
 <file path=customXml/item3.xml><?xml version="1.0" encoding="utf-8"?>
-<p:properties xmlns:p="http://schemas.microsoft.com/office/2006/metadata/properties" xmlns:xsi="http://www.w3.org/2001/XMLSchema-instance" xmlns:pc="http://schemas.microsoft.com/office/infopath/2007/PartnerControls">
-  <documentManagement>
-    <DirectSourceMarket xmlns="4873beb7-5857-4685-be1f-d57550cc96cc" xsi:nil="true"/>
-    <ApprovalStatus xmlns="4873beb7-5857-4685-be1f-d57550cc96cc">InProgress</ApprovalStatus>
-    <MarketSpecific xmlns="4873beb7-5857-4685-be1f-d57550cc96cc">false</MarketSpecific>
-    <LocComments xmlns="4873beb7-5857-4685-be1f-d57550cc96cc" xsi:nil="true"/>
-    <ThumbnailAssetId xmlns="4873beb7-5857-4685-be1f-d57550cc96cc" xsi:nil="true"/>
-    <PrimaryImageGen xmlns="4873beb7-5857-4685-be1f-d57550cc96cc">true</PrimaryImageGen>
-    <LegacyData xmlns="4873beb7-5857-4685-be1f-d57550cc96cc" xsi:nil="true"/>
-    <LocRecommendedHandoff xmlns="4873beb7-5857-4685-be1f-d57550cc96cc" xsi:nil="true"/>
-    <BusinessGroup xmlns="4873beb7-5857-4685-be1f-d57550cc96cc" xsi:nil="true"/>
-    <BlockPublish xmlns="4873beb7-5857-4685-be1f-d57550cc96cc">false</BlockPublish>
-    <TPFriendlyName xmlns="4873beb7-5857-4685-be1f-d57550cc96cc" xsi:nil="true"/>
-    <NumericId xmlns="4873beb7-5857-4685-be1f-d57550cc96cc" xsi:nil="true"/>
-    <APEditor xmlns="4873beb7-5857-4685-be1f-d57550cc96cc">
-      <UserInfo>
-        <DisplayName/>
-        <AccountId xsi:nil="true"/>
-        <AccountType/>
-      </UserInfo>
-    </APEditor>
-    <SourceTitle xmlns="4873beb7-5857-4685-be1f-d57550cc96cc" xsi:nil="true"/>
-    <OpenTemplate xmlns="4873beb7-5857-4685-be1f-d57550cc96cc">true</OpenTemplate>
-    <UALocComments xmlns="4873beb7-5857-4685-be1f-d57550cc96cc">2007 Template UpLeveling Do Not HandOff</UALocComments>
-    <ParentAssetId xmlns="4873beb7-5857-4685-be1f-d57550cc96cc" xsi:nil="true"/>
-    <IntlLangReviewDate xmlns="4873beb7-5857-4685-be1f-d57550cc96cc" xsi:nil="true"/>
-    <FeatureTagsTaxHTField0 xmlns="4873beb7-5857-4685-be1f-d57550cc96cc">
-      <Terms xmlns="http://schemas.microsoft.com/office/infopath/2007/PartnerControls"/>
-    </FeatureTagsTaxHTField0>
-    <PublishStatusLookup xmlns="4873beb7-5857-4685-be1f-d57550cc96cc">
-      <Value>1370089</Value>
-      <Value>1531210</Value>
-    </PublishStatusLookup>
-    <Providers xmlns="4873beb7-5857-4685-be1f-d57550cc96cc" xsi:nil="true"/>
-    <MachineTranslated xmlns="4873beb7-5857-4685-be1f-d57550cc96cc">false</MachineTranslated>
-    <OriginalSourceMarket xmlns="4873beb7-5857-4685-be1f-d57550cc96cc" xsi:nil="true"/>
-    <APDescription xmlns="4873beb7-5857-4685-be1f-d57550cc96cc" xsi:nil="true"/>
-    <ClipArtFilename xmlns="4873beb7-5857-4685-be1f-d57550cc96cc" xsi:nil="true"/>
-    <ContentItem xmlns="4873beb7-5857-4685-be1f-d57550cc96cc" xsi:nil="true"/>
-    <TPInstallLocation xmlns="4873beb7-5857-4685-be1f-d57550cc96cc" xsi:nil="true"/>
-    <PublishTargets xmlns="4873beb7-5857-4685-be1f-d57550cc96cc">OfficeOnline,OfficeOnlineVNext</PublishTargets>
-    <TimesCloned xmlns="4873beb7-5857-4685-be1f-d57550cc96cc" xsi:nil="true"/>
-    <AssetStart xmlns="4873beb7-5857-4685-be1f-d57550cc96cc">2011-12-15T21:13:00+00:00</AssetStart>
-    <Provider xmlns="4873beb7-5857-4685-be1f-d57550cc96cc" xsi:nil="true"/>
-    <AcquiredFrom xmlns="4873beb7-5857-4685-be1f-d57550cc96cc">Internal MS</AcquiredFrom>
-    <FriendlyTitle xmlns="4873beb7-5857-4685-be1f-d57550cc96cc" xsi:nil="true"/>
-    <LastHandOff xmlns="4873beb7-5857-4685-be1f-d57550cc96cc" xsi:nil="true"/>
-    <TPClientViewer xmlns="4873beb7-5857-4685-be1f-d57550cc96cc" xsi:nil="true"/>
-    <ShowIn xmlns="4873beb7-5857-4685-be1f-d57550cc96cc">Show everywhere</ShowIn>
-    <UANotes xmlns="4873beb7-5857-4685-be1f-d57550cc96cc" xsi:nil="true"/>
-    <TemplateStatus xmlns="4873beb7-5857-4685-be1f-d57550cc96cc">Complete</TemplateStatus>
-    <InternalTagsTaxHTField0 xmlns="4873beb7-5857-4685-be1f-d57550cc96cc">
-      <Terms xmlns="http://schemas.microsoft.com/office/infopath/2007/PartnerControls"/>
-    </InternalTagsTaxHTField0>
-    <CSXHash xmlns="4873beb7-5857-4685-be1f-d57550cc96cc" xsi:nil="true"/>
-    <Downloads xmlns="4873beb7-5857-4685-be1f-d57550cc96cc">0</Downloads>
-    <VoteCount xmlns="4873beb7-5857-4685-be1f-d57550cc96cc" xsi:nil="true"/>
-    <OOCacheId xmlns="4873beb7-5857-4685-be1f-d57550cc96cc" xsi:nil="true"/>
-    <IsDeleted xmlns="4873beb7-5857-4685-be1f-d57550cc96cc">false</IsDeleted>
-    <AssetExpire xmlns="4873beb7-5857-4685-be1f-d57550cc96cc">2035-01-01T08:00:00+00:00</AssetExpire>
-    <DSATActionTaken xmlns="4873beb7-5857-4685-be1f-d57550cc96cc" xsi:nil="true"/>
-    <CSXSubmissionMarket xmlns="4873beb7-5857-4685-be1f-d57550cc96cc" xsi:nil="true"/>
-    <TPExecutable xmlns="4873beb7-5857-4685-be1f-d57550cc96cc" xsi:nil="true"/>
-    <SubmitterId xmlns="4873beb7-5857-4685-be1f-d57550cc96cc" xsi:nil="true"/>
-    <EditorialTags xmlns="4873beb7-5857-4685-be1f-d57550cc96cc" xsi:nil="true"/>
-    <ApprovalLog xmlns="4873beb7-5857-4685-be1f-d57550cc96cc" xsi:nil="true"/>
-    <AssetType xmlns="4873beb7-5857-4685-be1f-d57550cc96cc">TP</AssetType>
-    <BugNumber xmlns="4873beb7-5857-4685-be1f-d57550cc96cc" xsi:nil="true"/>
-    <CSXSubmissionDate xmlns="4873beb7-5857-4685-be1f-d57550cc96cc" xsi:nil="true"/>
-    <CSXUpdate xmlns="4873beb7-5857-4685-be1f-d57550cc96cc">false</CSXUpdate>
-    <Milestone xmlns="4873beb7-5857-4685-be1f-d57550cc96cc" xsi:nil="true"/>
-    <RecommendationsModifier xmlns="4873beb7-5857-4685-be1f-d57550cc96cc" xsi:nil="true"/>
-    <OriginAsset xmlns="4873beb7-5857-4685-be1f-d57550cc96cc" xsi:nil="true"/>
-    <TPComponent xmlns="4873beb7-5857-4685-be1f-d57550cc96cc" xsi:nil="true"/>
-    <AssetId xmlns="4873beb7-5857-4685-be1f-d57550cc96cc">TP102802872</AssetId>
-    <IntlLocPriority xmlns="4873beb7-5857-4685-be1f-d57550cc96cc" xsi:nil="true"/>
-    <PolicheckWords xmlns="4873beb7-5857-4685-be1f-d57550cc96cc" xsi:nil="true"/>
-    <TPLaunchHelpLink xmlns="4873beb7-5857-4685-be1f-d57550cc96cc" xsi:nil="true"/>
-    <TPApplication xmlns="4873beb7-5857-4685-be1f-d57550cc96cc" xsi:nil="true"/>
-    <CrawlForDependencies xmlns="4873beb7-5857-4685-be1f-d57550cc96cc">false</CrawlForDependencies>
-    <HandoffToMSDN xmlns="4873beb7-5857-4685-be1f-d57550cc96cc" xsi:nil="true"/>
-    <PlannedPubDate xmlns="4873beb7-5857-4685-be1f-d57550cc96cc" xsi:nil="true"/>
-    <IntlLangReviewer xmlns="4873beb7-5857-4685-be1f-d57550cc96cc" xsi:nil="true"/>
-    <TrustLevel xmlns="4873beb7-5857-4685-be1f-d57550cc96cc">1 Microsoft Managed Content</TrustLevel>
-    <LocLastLocAttemptVersionLookup xmlns="4873beb7-5857-4685-be1f-d57550cc96cc">715235</LocLastLocAttemptVersionLookup>
-    <IsSearchable xmlns="4873beb7-5857-4685-be1f-d57550cc96cc">true</IsSearchable>
-    <TemplateTemplateType xmlns="4873beb7-5857-4685-be1f-d57550cc96cc">Word 2007 Default</TemplateTemplateType>
-    <CampaignTagsTaxHTField0 xmlns="4873beb7-5857-4685-be1f-d57550cc96cc">
-      <Terms xmlns="http://schemas.microsoft.com/office/infopath/2007/PartnerControls"/>
-    </CampaignTagsTaxHTField0>
-    <TPNamespace xmlns="4873beb7-5857-4685-be1f-d57550cc96cc" xsi:nil="true"/>
-    <TaxCatchAll xmlns="4873beb7-5857-4685-be1f-d57550cc96cc"/>
-    <Markets xmlns="4873beb7-5857-4685-be1f-d57550cc96cc"/>
-    <UAProjectedTotalWords xmlns="4873beb7-5857-4685-be1f-d57550cc96cc" xsi:nil="true"/>
-    <IntlLangReview xmlns="4873beb7-5857-4685-be1f-d57550cc96cc">false</IntlLangReview>
-    <OutputCachingOn xmlns="4873beb7-5857-4685-be1f-d57550cc96cc">false</OutputCachingOn>
-    <AverageRating xmlns="4873beb7-5857-4685-be1f-d57550cc96cc" xsi:nil="true"/>
-    <APAuthor xmlns="4873beb7-5857-4685-be1f-d57550cc96cc">
-      <UserInfo>
-        <DisplayName>REDMOND\v-gakel</DisplayName>
-        <AccountId>2721</AccountId>
-        <AccountType/>
-      </UserInfo>
-    </APAuthor>
-    <LocManualTestRequired xmlns="4873beb7-5857-4685-be1f-d57550cc96cc">false</LocManualTestRequired>
-    <TPCommandLine xmlns="4873beb7-5857-4685-be1f-d57550cc96cc" xsi:nil="true"/>
-    <TPAppVersion xmlns="4873beb7-5857-4685-be1f-d57550cc96cc" xsi:nil="true"/>
-    <EditorialStatus xmlns="4873beb7-5857-4685-be1f-d57550cc96cc" xsi:nil="true"/>
-    <LastModifiedDateTime xmlns="4873beb7-5857-4685-be1f-d57550cc96cc" xsi:nil="true"/>
-    <ScenarioTagsTaxHTField0 xmlns="4873beb7-5857-4685-be1f-d57550cc96cc">
-      <Terms xmlns="http://schemas.microsoft.com/office/infopath/2007/PartnerControls"/>
-    </ScenarioTagsTaxHTField0>
-    <OriginalRelease xmlns="4873beb7-5857-4685-be1f-d57550cc96cc">14</OriginalRelease>
-    <TPLaunchHelpLinkType xmlns="4873beb7-5857-4685-be1f-d57550cc96cc">Template</TPLaunchHelpLinkType>
-    <LocalizationTagsTaxHTField0 xmlns="4873beb7-5857-4685-be1f-d57550cc96cc">
-      <Terms xmlns="http://schemas.microsoft.com/office/infopath/2007/PartnerControls"/>
-    </LocalizationTagsTaxHTField0>
-    <UACurrentWords xmlns="4873beb7-5857-4685-be1f-d57550cc96cc" xsi:nil="true"/>
-    <ArtSampleDocs xmlns="4873beb7-5857-4685-be1f-d57550cc96cc" xsi:nil="true"/>
-    <UALocRecommendation xmlns="4873beb7-5857-4685-be1f-d57550cc96cc">Localize</UALocRecommendation>
-    <Manager xmlns="4873beb7-5857-4685-be1f-d57550cc96cc" xsi:nil="true"/>
-    <LocMarketGroupTiers2 xmlns="4873beb7-5857-4685-be1f-d57550cc96cc">,t:Tier 1,t:Tier 2,t:Tier 3,</LocMarketGroupTiers2>
-  </documentManagement>
-</p:properties>
+<b:Sources xmlns:b="http://schemas.openxmlformats.org/officeDocument/2006/bibliography" xmlns="http://schemas.openxmlformats.org/officeDocument/2006/bibliography" SelectedStyle="/APASixthEditionOfficeOnline.xsl" StyleName="APA" Version="6"/>
 </file>
 
 <file path=customXml/item4.xml><?xml version="1.0" encoding="utf-8"?>
@@ -8532,9 +8623,11 @@
 </file>
 
 <file path=customXml/itemProps1.xml><?xml version="1.0" encoding="utf-8"?>
-<ds:datastoreItem xmlns:ds="http://schemas.openxmlformats.org/officeDocument/2006/customXml" ds:itemID="{EDB13EB8-44E8-401C-A1E5-6A68E23AEDB2}">
+<ds:datastoreItem xmlns:ds="http://schemas.openxmlformats.org/officeDocument/2006/customXml" ds:itemID="{CBD348DC-98DA-4004-8F63-30B02DAA0E87}">
   <ds:schemaRefs>
-    <ds:schemaRef ds:uri="http://schemas.openxmlformats.org/officeDocument/2006/bibliography"/>
+    <ds:schemaRef ds:uri="http://schemas.microsoft.com/office/2006/metadata/properties"/>
+    <ds:schemaRef ds:uri="http://schemas.microsoft.com/office/infopath/2007/PartnerControls"/>
+    <ds:schemaRef ds:uri="4873beb7-5857-4685-be1f-d57550cc96cc"/>
   </ds:schemaRefs>
 </ds:datastoreItem>
 </file>
@@ -8558,11 +8651,9 @@
 </file>
 
 <file path=customXml/itemProps3.xml><?xml version="1.0" encoding="utf-8"?>
-<ds:datastoreItem xmlns:ds="http://schemas.openxmlformats.org/officeDocument/2006/customXml" ds:itemID="{CBD348DC-98DA-4004-8F63-30B02DAA0E87}">
+<ds:datastoreItem xmlns:ds="http://schemas.openxmlformats.org/officeDocument/2006/customXml" ds:itemID="{EDB13EB8-44E8-401C-A1E5-6A68E23AEDB2}">
   <ds:schemaRefs>
-    <ds:schemaRef ds:uri="http://schemas.microsoft.com/office/2006/metadata/properties"/>
-    <ds:schemaRef ds:uri="http://schemas.microsoft.com/office/infopath/2007/PartnerControls"/>
-    <ds:schemaRef ds:uri="4873beb7-5857-4685-be1f-d57550cc96cc"/>
+    <ds:schemaRef ds:uri="http://schemas.openxmlformats.org/officeDocument/2006/bibliography"/>
   </ds:schemaRefs>
 </ds:datastoreItem>
 </file>

</xml_diff>